<commit_message>
Phase 3 frontend: shop, cart, wallet, live canteen menu/board/QR, festival page; UTC dates; responsive header; e2e; docs
</commit_message>
<xml_diff>
--- a/docs/راهنمای-راه‌اندازی-سایت-خشایار.docx
+++ b/docs/راهنمای-راه‌اندازی-سایت-خشایار.docx
@@ -2566,7 +2566,7 @@
                 <w:szCs w:val="20"/>
                 <w:rtl/>
               </w:rPr>
-              <w:t xml:space="preserve">فاز ۳ و ۴: شاپ، بوفه، کیف پول، پنل‌ها</w:t>
+              <w:t xml:space="preserve">فاز ۴: پنل‌های مدیر، پذیرش، مربی و پیامک‌های خودکار</w:t>
             </w:r>
           </w:p>
         </w:tc>
@@ -2632,7 +2632,7 @@
                 <w:szCs w:val="20"/>
                 <w:rtl/>
               </w:rPr>
-              <w:t xml:space="preserve">محتوا از باشگاه</w:t>
+              <w:t xml:space="preserve">فهرست کارکنان</w:t>
             </w:r>
           </w:p>
         </w:tc>
@@ -6850,7 +6850,7 @@
           <w:rFonts w:ascii="Tahoma" w:cs="Tahoma" w:eastAsia="Tahoma" w:hAnsi="Tahoma"/>
           <w:rtl/>
         </w:rPr>
-        <w:t xml:space="preserve">رنگ‌بندی آبی هماهنگ با لوگو</w:t>
+        <w:t xml:space="preserve">فاز ۳: شاپ خشایار با موجودی هر شعبه، منوی بوفه با QR و تابلوی لحظه‌ای، کیف پول، صفحهٔ جشنواره</w:t>
       </w:r>
     </w:p>
     <w:p>
@@ -6874,7 +6874,31 @@
           <w:rFonts w:ascii="Tahoma" w:cs="Tahoma" w:eastAsia="Tahoma" w:hAnsi="Tahoma"/>
           <w:rtl/>
         </w:rPr>
-        <w:t xml:space="preserve">امنیت پایه: رمزنگاری نشست، محدودیت تعداد درخواست، بررسی مبلغ پرداخت سمت سرور، و بیش از ۴۰ تست خودکار</w:t>
+        <w:t xml:space="preserve">رنگ‌بندی آبی هماهنگ با لوگو</w:t>
+      </w:r>
+    </w:p>
+    <w:p>
+      <w:pPr>
+        <w:bidi/>
+        <w:spacing w:after="70" w:line="340"/>
+        <w:ind w:start="360"/>
+      </w:pPr>
+      <w:r>
+        <w:rPr>
+          <w:rFonts w:ascii="Tahoma" w:cs="Tahoma" w:eastAsia="Tahoma" w:hAnsi="Tahoma"/>
+          <w:b/>
+          <w:bCs/>
+          <w:color w:val="1F9D55"/>
+          <w:rtl/>
+        </w:rPr>
+        <w:t xml:space="preserve">✔  </w:t>
+      </w:r>
+      <w:r>
+        <w:rPr>
+          <w:rFonts w:ascii="Tahoma" w:cs="Tahoma" w:eastAsia="Tahoma" w:hAnsi="Tahoma"/>
+          <w:rtl/>
+        </w:rPr>
+        <w:t xml:space="preserve">امنیت پایه: نشست امن، محدودیت تعداد درخواست، بررسی مبلغ پرداخت سمت سرور، و بیش از ۸۰ تست خودکار</w:t>
       </w:r>
     </w:p>
     <w:p>
@@ -7759,7 +7783,7 @@
           <w:szCs w:val="26"/>
           <w:rtl/>
         </w:rPr>
-        <w:t xml:space="preserve">  فاز ۳ و ۴</w:t>
+        <w:t xml:space="preserve">  فاز ۴ (پنل‌ها)</w:t>
       </w:r>
     </w:p>
     <w:p>
@@ -7783,7 +7807,7 @@
           <w:rFonts w:ascii="Tahoma" w:cs="Tahoma" w:eastAsia="Tahoma" w:hAnsi="Tahoma"/>
           <w:rtl/>
         </w:rPr>
-        <w:t xml:space="preserve">شاپ خشایار، بوفه با QR، کیف پول، مدیریت جشنواره</w:t>
+        <w:t xml:space="preserve">ساخت و ویرایش جشنواره، کالاها، منو و موجودی از پنل مدیر</w:t>
       </w:r>
     </w:p>
     <w:p>
@@ -10013,7 +10037,7 @@
                 <w:szCs w:val="20"/>
                 <w:rtl/>
               </w:rPr>
-              <w:t xml:space="preserve">شاپ، بوفه، کیف پول، مدیریت جشنواره</w:t>
+              <w:t xml:space="preserve">شاپ خشایار (مکمل، پوشاک، لوازم)</w:t>
             </w:r>
           </w:p>
         </w:tc>
@@ -10046,7 +10070,7 @@
                 <w:szCs w:val="20"/>
                 <w:rtl/>
               </w:rPr>
-              <w:t xml:space="preserve">فاز ۳</w:t>
+              <w:t xml:space="preserve">کار می‌کند با کالاهای نمونه</w:t>
             </w:r>
           </w:p>
         </w:tc>
@@ -10079,7 +10103,7 @@
                 <w:szCs w:val="20"/>
                 <w:rtl/>
               </w:rPr>
-              <w:t xml:space="preserve">محصولات، منو، موجودی؛ پرسش از درگاه دربارهٔ کیف پول</w:t>
+              <w:t xml:space="preserve">فهرست واقعی کالاها، عکس، قیمت و موجودی هر شعبه</w:t>
             </w:r>
           </w:p>
         </w:tc>
@@ -10112,7 +10136,7 @@
                 <w:szCs w:val="20"/>
                 <w:rtl/>
               </w:rPr>
-              <w:t xml:space="preserve">باشگاه + ما</w:t>
+              <w:t xml:space="preserve">باشگاه</w:t>
             </w:r>
           </w:p>
         </w:tc>
@@ -10150,7 +10174,7 @@
                 <w:szCs w:val="20"/>
                 <w:rtl/>
               </w:rPr>
-              <w:t xml:space="preserve">پنل مدیر، پذیرش، مربی، بوفه، فروشگاه</w:t>
+              <w:t xml:space="preserve">منوی بوفه با QR و تابلوی لحظه‌ای</w:t>
             </w:r>
           </w:p>
         </w:tc>
@@ -10183,7 +10207,7 @@
                 <w:szCs w:val="20"/>
                 <w:rtl/>
               </w:rPr>
-              <w:t xml:space="preserve">فاز ۴</w:t>
+              <w:t xml:space="preserve">کار می‌کند با منوی نمونه</w:t>
             </w:r>
           </w:p>
         </w:tc>
@@ -10216,7 +10240,7 @@
                 <w:szCs w:val="20"/>
                 <w:rtl/>
               </w:rPr>
-              <w:t xml:space="preserve">فهرست کارکنان و نقش‌ها</w:t>
+              <w:t xml:space="preserve">منو و قیمت واقعی، چاپ QR میزها، یک تبلت پشت پیشخوان</w:t>
             </w:r>
           </w:p>
         </w:tc>
@@ -10249,7 +10273,7 @@
                 <w:szCs w:val="20"/>
                 <w:rtl/>
               </w:rPr>
-              <w:t xml:space="preserve">باشگاه + ما</w:t>
+              <w:t xml:space="preserve">باشگاه</w:t>
             </w:r>
           </w:p>
         </w:tc>
@@ -10287,6 +10311,417 @@
                 <w:szCs w:val="20"/>
                 <w:rtl/>
               </w:rPr>
+              <w:t xml:space="preserve">کیف پول</w:t>
+            </w:r>
+          </w:p>
+        </w:tc>
+        <w:tc>
+          <w:tcPr>
+            <w:tcW w:type="dxa" w:w="2007"/>
+            <w:tcBorders>
+              <w:top w:val="single" w:color="D9D9D9" w:sz="4"/>
+              <w:left w:val="single" w:color="D9D9D9" w:sz="4"/>
+              <w:bottom w:val="single" w:color="D9D9D9" w:sz="4"/>
+              <w:right w:val="single" w:color="D9D9D9" w:sz="4"/>
+            </w:tcBorders>
+            <w:shd w:fill="F7F9FC" w:color="auto" w:val="clear"/>
+            <w:tcMar>
+              <w:top w:type="dxa" w:w="80"/>
+              <w:left w:type="dxa" w:w="110"/>
+              <w:bottom w:type="dxa" w:w="80"/>
+              <w:right w:type="dxa" w:w="110"/>
+            </w:tcMar>
+          </w:tcPr>
+          <w:p>
+            <w:pPr>
+              <w:bidi/>
+              <w:spacing w:after="0" w:line="300"/>
+            </w:pPr>
+            <w:r>
+              <w:rPr>
+                <w:rFonts w:ascii="Tahoma" w:cs="Tahoma" w:eastAsia="Tahoma" w:hAnsi="Tahoma"/>
+                <w:sz w:val="20"/>
+                <w:szCs w:val="20"/>
+                <w:rtl/>
+              </w:rPr>
+              <w:t xml:space="preserve">کار می‌کند</w:t>
+            </w:r>
+          </w:p>
+        </w:tc>
+        <w:tc>
+          <w:tcPr>
+            <w:tcW w:type="dxa" w:w="3413"/>
+            <w:tcBorders>
+              <w:top w:val="single" w:color="D9D9D9" w:sz="4"/>
+              <w:left w:val="single" w:color="D9D9D9" w:sz="4"/>
+              <w:bottom w:val="single" w:color="D9D9D9" w:sz="4"/>
+              <w:right w:val="single" w:color="D9D9D9" w:sz="4"/>
+            </w:tcBorders>
+            <w:shd w:fill="F7F9FC" w:color="auto" w:val="clear"/>
+            <w:tcMar>
+              <w:top w:type="dxa" w:w="80"/>
+              <w:left w:type="dxa" w:w="110"/>
+              <w:bottom w:type="dxa" w:w="80"/>
+              <w:right w:type="dxa" w:w="110"/>
+            </w:tcMar>
+          </w:tcPr>
+          <w:p>
+            <w:pPr>
+              <w:bidi/>
+              <w:spacing w:after="0" w:line="300"/>
+            </w:pPr>
+            <w:r>
+              <w:rPr>
+                <w:rFonts w:ascii="Tahoma" w:cs="Tahoma" w:eastAsia="Tahoma" w:hAnsi="Tahoma"/>
+                <w:sz w:val="20"/>
+                <w:szCs w:val="20"/>
+                <w:rtl/>
+              </w:rPr>
+              <w:t xml:space="preserve">تأیید درگاه برای شارژ کیف پول</w:t>
+            </w:r>
+          </w:p>
+        </w:tc>
+        <w:tc>
+          <w:tcPr>
+            <w:tcW w:type="dxa" w:w="1608"/>
+            <w:tcBorders>
+              <w:top w:val="single" w:color="D9D9D9" w:sz="4"/>
+              <w:left w:val="single" w:color="D9D9D9" w:sz="4"/>
+              <w:bottom w:val="single" w:color="D9D9D9" w:sz="4"/>
+              <w:right w:val="single" w:color="D9D9D9" w:sz="4"/>
+            </w:tcBorders>
+            <w:shd w:fill="F7F9FC" w:color="auto" w:val="clear"/>
+            <w:tcMar>
+              <w:top w:type="dxa" w:w="80"/>
+              <w:left w:type="dxa" w:w="110"/>
+              <w:bottom w:type="dxa" w:w="80"/>
+              <w:right w:type="dxa" w:w="110"/>
+            </w:tcMar>
+          </w:tcPr>
+          <w:p>
+            <w:pPr>
+              <w:bidi/>
+              <w:spacing w:after="0" w:line="300"/>
+            </w:pPr>
+            <w:r>
+              <w:rPr>
+                <w:rFonts w:ascii="Tahoma" w:cs="Tahoma" w:eastAsia="Tahoma" w:hAnsi="Tahoma"/>
+                <w:sz w:val="20"/>
+                <w:szCs w:val="20"/>
+                <w:rtl/>
+              </w:rPr>
+              <w:t xml:space="preserve">باشگاه</w:t>
+            </w:r>
+          </w:p>
+        </w:tc>
+      </w:tr>
+      <w:tr>
+        <w:trPr>
+          <w:cantSplit/>
+        </w:trPr>
+        <w:tc>
+          <w:tcPr>
+            <w:tcW w:type="dxa" w:w="2610"/>
+            <w:tcBorders>
+              <w:top w:val="single" w:color="D9D9D9" w:sz="4"/>
+              <w:left w:val="single" w:color="D9D9D9" w:sz="4"/>
+              <w:bottom w:val="single" w:color="D9D9D9" w:sz="4"/>
+              <w:right w:val="single" w:color="D9D9D9" w:sz="4"/>
+            </w:tcBorders>
+            <w:shd w:fill="FFFFFF" w:color="auto" w:val="clear"/>
+            <w:tcMar>
+              <w:top w:type="dxa" w:w="80"/>
+              <w:left w:type="dxa" w:w="110"/>
+              <w:bottom w:type="dxa" w:w="80"/>
+              <w:right w:type="dxa" w:w="110"/>
+            </w:tcMar>
+          </w:tcPr>
+          <w:p>
+            <w:pPr>
+              <w:bidi/>
+              <w:spacing w:after="0" w:line="300"/>
+            </w:pPr>
+            <w:r>
+              <w:rPr>
+                <w:rFonts w:ascii="Tahoma" w:cs="Tahoma" w:eastAsia="Tahoma" w:hAnsi="Tahoma"/>
+                <w:sz w:val="20"/>
+                <w:szCs w:val="20"/>
+                <w:rtl/>
+              </w:rPr>
+              <w:t xml:space="preserve">صفحهٔ جشنواره</w:t>
+            </w:r>
+          </w:p>
+        </w:tc>
+        <w:tc>
+          <w:tcPr>
+            <w:tcW w:type="dxa" w:w="2007"/>
+            <w:tcBorders>
+              <w:top w:val="single" w:color="D9D9D9" w:sz="4"/>
+              <w:left w:val="single" w:color="D9D9D9" w:sz="4"/>
+              <w:bottom w:val="single" w:color="D9D9D9" w:sz="4"/>
+              <w:right w:val="single" w:color="D9D9D9" w:sz="4"/>
+            </w:tcBorders>
+            <w:shd w:fill="FFFFFF" w:color="auto" w:val="clear"/>
+            <w:tcMar>
+              <w:top w:type="dxa" w:w="80"/>
+              <w:left w:type="dxa" w:w="110"/>
+              <w:bottom w:type="dxa" w:w="80"/>
+              <w:right w:type="dxa" w:w="110"/>
+            </w:tcMar>
+          </w:tcPr>
+          <w:p>
+            <w:pPr>
+              <w:bidi/>
+              <w:spacing w:after="0" w:line="300"/>
+            </w:pPr>
+            <w:r>
+              <w:rPr>
+                <w:rFonts w:ascii="Tahoma" w:cs="Tahoma" w:eastAsia="Tahoma" w:hAnsi="Tahoma"/>
+                <w:sz w:val="20"/>
+                <w:szCs w:val="20"/>
+                <w:rtl/>
+              </w:rPr>
+              <w:t xml:space="preserve">کار می‌کند</w:t>
+            </w:r>
+          </w:p>
+        </w:tc>
+        <w:tc>
+          <w:tcPr>
+            <w:tcW w:type="dxa" w:w="3413"/>
+            <w:tcBorders>
+              <w:top w:val="single" w:color="D9D9D9" w:sz="4"/>
+              <w:left w:val="single" w:color="D9D9D9" w:sz="4"/>
+              <w:bottom w:val="single" w:color="D9D9D9" w:sz="4"/>
+              <w:right w:val="single" w:color="D9D9D9" w:sz="4"/>
+            </w:tcBorders>
+            <w:shd w:fill="FFFFFF" w:color="auto" w:val="clear"/>
+            <w:tcMar>
+              <w:top w:type="dxa" w:w="80"/>
+              <w:left w:type="dxa" w:w="110"/>
+              <w:bottom w:type="dxa" w:w="80"/>
+              <w:right w:type="dxa" w:w="110"/>
+            </w:tcMar>
+          </w:tcPr>
+          <w:p>
+            <w:pPr>
+              <w:bidi/>
+              <w:spacing w:after="0" w:line="300"/>
+            </w:pPr>
+            <w:r>
+              <w:rPr>
+                <w:rFonts w:ascii="Tahoma" w:cs="Tahoma" w:eastAsia="Tahoma" w:hAnsi="Tahoma"/>
+                <w:sz w:val="20"/>
+                <w:szCs w:val="20"/>
+                <w:rtl/>
+              </w:rPr>
+              <w:t xml:space="preserve">تعریف جشنوارهٔ واقعی (از پنل مدیر در فاز ۴)</w:t>
+            </w:r>
+          </w:p>
+        </w:tc>
+        <w:tc>
+          <w:tcPr>
+            <w:tcW w:type="dxa" w:w="1608"/>
+            <w:tcBorders>
+              <w:top w:val="single" w:color="D9D9D9" w:sz="4"/>
+              <w:left w:val="single" w:color="D9D9D9" w:sz="4"/>
+              <w:bottom w:val="single" w:color="D9D9D9" w:sz="4"/>
+              <w:right w:val="single" w:color="D9D9D9" w:sz="4"/>
+            </w:tcBorders>
+            <w:shd w:fill="FFFFFF" w:color="auto" w:val="clear"/>
+            <w:tcMar>
+              <w:top w:type="dxa" w:w="80"/>
+              <w:left w:type="dxa" w:w="110"/>
+              <w:bottom w:type="dxa" w:w="80"/>
+              <w:right w:type="dxa" w:w="110"/>
+            </w:tcMar>
+          </w:tcPr>
+          <w:p>
+            <w:pPr>
+              <w:bidi/>
+              <w:spacing w:after="0" w:line="300"/>
+            </w:pPr>
+            <w:r>
+              <w:rPr>
+                <w:rFonts w:ascii="Tahoma" w:cs="Tahoma" w:eastAsia="Tahoma" w:hAnsi="Tahoma"/>
+                <w:sz w:val="20"/>
+                <w:szCs w:val="20"/>
+                <w:rtl/>
+              </w:rPr>
+              <w:t xml:space="preserve">باشگاه + ما</w:t>
+            </w:r>
+          </w:p>
+        </w:tc>
+      </w:tr>
+      <w:tr>
+        <w:trPr>
+          <w:cantSplit/>
+        </w:trPr>
+        <w:tc>
+          <w:tcPr>
+            <w:tcW w:type="dxa" w:w="2610"/>
+            <w:tcBorders>
+              <w:top w:val="single" w:color="D9D9D9" w:sz="4"/>
+              <w:left w:val="single" w:color="D9D9D9" w:sz="4"/>
+              <w:bottom w:val="single" w:color="D9D9D9" w:sz="4"/>
+              <w:right w:val="single" w:color="D9D9D9" w:sz="4"/>
+            </w:tcBorders>
+            <w:shd w:fill="F7F9FC" w:color="auto" w:val="clear"/>
+            <w:tcMar>
+              <w:top w:type="dxa" w:w="80"/>
+              <w:left w:type="dxa" w:w="110"/>
+              <w:bottom w:type="dxa" w:w="80"/>
+              <w:right w:type="dxa" w:w="110"/>
+            </w:tcMar>
+          </w:tcPr>
+          <w:p>
+            <w:pPr>
+              <w:bidi/>
+              <w:spacing w:after="0" w:line="300"/>
+            </w:pPr>
+            <w:r>
+              <w:rPr>
+                <w:rFonts w:ascii="Tahoma" w:cs="Tahoma" w:eastAsia="Tahoma" w:hAnsi="Tahoma"/>
+                <w:sz w:val="20"/>
+                <w:szCs w:val="20"/>
+                <w:rtl/>
+              </w:rPr>
+              <w:t xml:space="preserve">پنل مدیر، پذیرش، مربی، بوفه، فروشگاه</w:t>
+            </w:r>
+          </w:p>
+        </w:tc>
+        <w:tc>
+          <w:tcPr>
+            <w:tcW w:type="dxa" w:w="2007"/>
+            <w:tcBorders>
+              <w:top w:val="single" w:color="D9D9D9" w:sz="4"/>
+              <w:left w:val="single" w:color="D9D9D9" w:sz="4"/>
+              <w:bottom w:val="single" w:color="D9D9D9" w:sz="4"/>
+              <w:right w:val="single" w:color="D9D9D9" w:sz="4"/>
+            </w:tcBorders>
+            <w:shd w:fill="F7F9FC" w:color="auto" w:val="clear"/>
+            <w:tcMar>
+              <w:top w:type="dxa" w:w="80"/>
+              <w:left w:type="dxa" w:w="110"/>
+              <w:bottom w:type="dxa" w:w="80"/>
+              <w:right w:type="dxa" w:w="110"/>
+            </w:tcMar>
+          </w:tcPr>
+          <w:p>
+            <w:pPr>
+              <w:bidi/>
+              <w:spacing w:after="0" w:line="300"/>
+            </w:pPr>
+            <w:r>
+              <w:rPr>
+                <w:rFonts w:ascii="Tahoma" w:cs="Tahoma" w:eastAsia="Tahoma" w:hAnsi="Tahoma"/>
+                <w:sz w:val="20"/>
+                <w:szCs w:val="20"/>
+                <w:rtl/>
+              </w:rPr>
+              <w:t xml:space="preserve">فاز ۴</w:t>
+            </w:r>
+          </w:p>
+        </w:tc>
+        <w:tc>
+          <w:tcPr>
+            <w:tcW w:type="dxa" w:w="3413"/>
+            <w:tcBorders>
+              <w:top w:val="single" w:color="D9D9D9" w:sz="4"/>
+              <w:left w:val="single" w:color="D9D9D9" w:sz="4"/>
+              <w:bottom w:val="single" w:color="D9D9D9" w:sz="4"/>
+              <w:right w:val="single" w:color="D9D9D9" w:sz="4"/>
+            </w:tcBorders>
+            <w:shd w:fill="F7F9FC" w:color="auto" w:val="clear"/>
+            <w:tcMar>
+              <w:top w:type="dxa" w:w="80"/>
+              <w:left w:type="dxa" w:w="110"/>
+              <w:bottom w:type="dxa" w:w="80"/>
+              <w:right w:type="dxa" w:w="110"/>
+            </w:tcMar>
+          </w:tcPr>
+          <w:p>
+            <w:pPr>
+              <w:bidi/>
+              <w:spacing w:after="0" w:line="300"/>
+            </w:pPr>
+            <w:r>
+              <w:rPr>
+                <w:rFonts w:ascii="Tahoma" w:cs="Tahoma" w:eastAsia="Tahoma" w:hAnsi="Tahoma"/>
+                <w:sz w:val="20"/>
+                <w:szCs w:val="20"/>
+                <w:rtl/>
+              </w:rPr>
+              <w:t xml:space="preserve">فهرست کارکنان و نقش‌ها</w:t>
+            </w:r>
+          </w:p>
+        </w:tc>
+        <w:tc>
+          <w:tcPr>
+            <w:tcW w:type="dxa" w:w="1608"/>
+            <w:tcBorders>
+              <w:top w:val="single" w:color="D9D9D9" w:sz="4"/>
+              <w:left w:val="single" w:color="D9D9D9" w:sz="4"/>
+              <w:bottom w:val="single" w:color="D9D9D9" w:sz="4"/>
+              <w:right w:val="single" w:color="D9D9D9" w:sz="4"/>
+            </w:tcBorders>
+            <w:shd w:fill="F7F9FC" w:color="auto" w:val="clear"/>
+            <w:tcMar>
+              <w:top w:type="dxa" w:w="80"/>
+              <w:left w:type="dxa" w:w="110"/>
+              <w:bottom w:type="dxa" w:w="80"/>
+              <w:right w:type="dxa" w:w="110"/>
+            </w:tcMar>
+          </w:tcPr>
+          <w:p>
+            <w:pPr>
+              <w:bidi/>
+              <w:spacing w:after="0" w:line="300"/>
+            </w:pPr>
+            <w:r>
+              <w:rPr>
+                <w:rFonts w:ascii="Tahoma" w:cs="Tahoma" w:eastAsia="Tahoma" w:hAnsi="Tahoma"/>
+                <w:sz w:val="20"/>
+                <w:szCs w:val="20"/>
+                <w:rtl/>
+              </w:rPr>
+              <w:t xml:space="preserve">باشگاه + ما</w:t>
+            </w:r>
+          </w:p>
+        </w:tc>
+      </w:tr>
+      <w:tr>
+        <w:trPr>
+          <w:cantSplit/>
+        </w:trPr>
+        <w:tc>
+          <w:tcPr>
+            <w:tcW w:type="dxa" w:w="2610"/>
+            <w:tcBorders>
+              <w:top w:val="single" w:color="D9D9D9" w:sz="4"/>
+              <w:left w:val="single" w:color="D9D9D9" w:sz="4"/>
+              <w:bottom w:val="single" w:color="D9D9D9" w:sz="4"/>
+              <w:right w:val="single" w:color="D9D9D9" w:sz="4"/>
+            </w:tcBorders>
+            <w:shd w:fill="FFFFFF" w:color="auto" w:val="clear"/>
+            <w:tcMar>
+              <w:top w:type="dxa" w:w="80"/>
+              <w:left w:type="dxa" w:w="110"/>
+              <w:bottom w:type="dxa" w:w="80"/>
+              <w:right w:type="dxa" w:w="110"/>
+            </w:tcMar>
+          </w:tcPr>
+          <w:p>
+            <w:pPr>
+              <w:bidi/>
+              <w:spacing w:after="0" w:line="300"/>
+            </w:pPr>
+            <w:r>
+              <w:rPr>
+                <w:rFonts w:ascii="Tahoma" w:cs="Tahoma" w:eastAsia="Tahoma" w:hAnsi="Tahoma"/>
+                <w:sz w:val="20"/>
+                <w:szCs w:val="20"/>
+                <w:rtl/>
+              </w:rPr>
               <w:t xml:space="preserve">پیامک خودکار (تمدید، تولد، جشنواره)</w:t>
             </w:r>
           </w:p>
@@ -10300,7 +10735,7 @@
               <w:bottom w:val="single" w:color="D9D9D9" w:sz="4"/>
               <w:right w:val="single" w:color="D9D9D9" w:sz="4"/>
             </w:tcBorders>
-            <w:shd w:fill="F7F9FC" w:color="auto" w:val="clear"/>
+            <w:shd w:fill="FFFFFF" w:color="auto" w:val="clear"/>
             <w:tcMar>
               <w:top w:type="dxa" w:w="80"/>
               <w:left w:type="dxa" w:w="110"/>
@@ -10333,7 +10768,7 @@
               <w:bottom w:val="single" w:color="D9D9D9" w:sz="4"/>
               <w:right w:val="single" w:color="D9D9D9" w:sz="4"/>
             </w:tcBorders>
-            <w:shd w:fill="F7F9FC" w:color="auto" w:val="clear"/>
+            <w:shd w:fill="FFFFFF" w:color="auto" w:val="clear"/>
             <w:tcMar>
               <w:top w:type="dxa" w:w="80"/>
               <w:left w:type="dxa" w:w="110"/>
@@ -10366,7 +10801,7 @@
               <w:bottom w:val="single" w:color="D9D9D9" w:sz="4"/>
               <w:right w:val="single" w:color="D9D9D9" w:sz="4"/>
             </w:tcBorders>
-            <w:shd w:fill="F7F9FC" w:color="auto" w:val="clear"/>
+            <w:shd w:fill="FFFFFF" w:color="auto" w:val="clear"/>
             <w:tcMar>
               <w:top w:type="dxa" w:w="80"/>
               <w:left w:type="dxa" w:w="110"/>
@@ -12140,7 +12575,7 @@
         </w:rPr>
         <w:t xml:space="preserve">مراحل و هزینهٔ اینماد: </w:t>
       </w:r>
-      <w:hyperlink w:history="1" r:id="rIdygpm6wmci13mi2y2fa0d1">
+      <w:hyperlink w:history="1" r:id="rIdcadihbe4_3fmmpvahxhtu">
         <w:r>
           <w:rPr>
             <w:rStyle w:val="Hyperlink"/>
@@ -12163,7 +12598,7 @@
         </w:rPr>
         <w:t xml:space="preserve">الزام کد مالیاتی برای درگاه: </w:t>
       </w:r>
-      <w:hyperlink w:history="1" r:id="rIdhyqzw1scx5r6jmanz0jq6">
+      <w:hyperlink w:history="1" r:id="rIdwo-1mrxxlpcedg6f3fph-">
         <w:r>
           <w:rPr>
             <w:rStyle w:val="Hyperlink"/>
@@ -12186,7 +12621,7 @@
         </w:rPr>
         <w:t xml:space="preserve">سامانه‌ها: </w:t>
       </w:r>
-      <w:hyperlink w:history="1" r:id="rIdhrs6chlbpu_sdiqm3mfyg">
+      <w:hyperlink w:history="1" r:id="rIdsvd5xb-v0klpg2jlwi2ye">
         <w:r>
           <w:rPr>
             <w:rStyle w:val="Hyperlink"/>
@@ -12203,7 +12638,7 @@
         </w:rPr>
         <w:t xml:space="preserve"> · </w:t>
       </w:r>
-      <w:hyperlink w:history="1" r:id="rIdlzxny-f69lhfw9pzzpmc8">
+      <w:hyperlink w:history="1" r:id="rIdlpm_fehlmwd8yczvywbvl">
         <w:r>
           <w:rPr>
             <w:rStyle w:val="Hyperlink"/>
@@ -12220,7 +12655,7 @@
         </w:rPr>
         <w:t xml:space="preserve"> · </w:t>
       </w:r>
-      <w:hyperlink w:history="1" r:id="rIdrbs3pge89e1mlkua5zuxv">
+      <w:hyperlink w:history="1" r:id="rId2vsdpogs3im3ubjtnbws_">
         <w:r>
           <w:rPr>
             <w:rStyle w:val="Hyperlink"/>

</xml_diff>

<commit_message>
Portfolio export refreshed (demo brand, schema-only item.json); unambiguous separators next to Persian digits; launch guide update
</commit_message>
<xml_diff>
--- a/docs/راهنمای-راه‌اندازی-سایت-خشایار.docx
+++ b/docs/راهنمای-راه‌اندازی-سایت-خشایار.docx
@@ -78,7 +78,7 @@
           <w:color w:val="6B6B6B"/>
           <w:rtl/>
         </w:rPr>
-        <w:t xml:space="preserve">نسخهٔ ۱ · ۲۴ مهر ۱۴۰۵</w:t>
+        <w:t xml:space="preserve">نسخهٔ ۱ – ۲۴ مهر ۱۴۰۵</w:t>
       </w:r>
     </w:p>
     <w:p>
@@ -6898,7 +6898,7 @@
           <w:rFonts w:ascii="Tahoma" w:cs="Tahoma" w:eastAsia="Tahoma" w:hAnsi="Tahoma"/>
           <w:rtl/>
         </w:rPr>
-        <w:t xml:space="preserve">امنیت پایه: نشست امن، محدودیت تعداد درخواست، بررسی مبلغ پرداخت سمت سرور، و بیش از ۸۰ تست خودکار</w:t>
+        <w:t xml:space="preserve">امنیت پایه: نشست امن، محدودیت تعداد درخواست، بررسی مبلغ پرداخت سمت سرور، و ۸۰ تست خودکار</w:t>
       </w:r>
     </w:p>
     <w:p>
@@ -12575,7 +12575,7 @@
         </w:rPr>
         <w:t xml:space="preserve">مراحل و هزینهٔ اینماد: </w:t>
       </w:r>
-      <w:hyperlink w:history="1" r:id="rIdcadihbe4_3fmmpvahxhtu">
+      <w:hyperlink w:history="1" r:id="rId-yzdgrmsh737drq89s8un">
         <w:r>
           <w:rPr>
             <w:rStyle w:val="Hyperlink"/>
@@ -12598,7 +12598,7 @@
         </w:rPr>
         <w:t xml:space="preserve">الزام کد مالیاتی برای درگاه: </w:t>
       </w:r>
-      <w:hyperlink w:history="1" r:id="rIdwo-1mrxxlpcedg6f3fph-">
+      <w:hyperlink w:history="1" r:id="rIdhwwn1z-ts7xs--bter72h">
         <w:r>
           <w:rPr>
             <w:rStyle w:val="Hyperlink"/>
@@ -12621,7 +12621,7 @@
         </w:rPr>
         <w:t xml:space="preserve">سامانه‌ها: </w:t>
       </w:r>
-      <w:hyperlink w:history="1" r:id="rIdsvd5xb-v0klpg2jlwi2ye">
+      <w:hyperlink w:history="1" r:id="rId-ccgkqbfwqob4jvvvn-tz">
         <w:r>
           <w:rPr>
             <w:rStyle w:val="Hyperlink"/>
@@ -12636,9 +12636,9 @@
           <w:rFonts w:ascii="Tahoma" w:cs="Tahoma" w:eastAsia="Tahoma" w:hAnsi="Tahoma"/>
           <w:rtl/>
         </w:rPr>
-        <w:t xml:space="preserve"> · </w:t>
-      </w:r>
-      <w:hyperlink w:history="1" r:id="rIdlpm_fehlmwd8yczvywbvl">
+        <w:t xml:space="preserve"> – </w:t>
+      </w:r>
+      <w:hyperlink w:history="1" r:id="rId875c6uv2cuxf5apb5s6zg">
         <w:r>
           <w:rPr>
             <w:rStyle w:val="Hyperlink"/>
@@ -12653,9 +12653,9 @@
           <w:rFonts w:ascii="Tahoma" w:cs="Tahoma" w:eastAsia="Tahoma" w:hAnsi="Tahoma"/>
           <w:rtl/>
         </w:rPr>
-        <w:t xml:space="preserve"> · </w:t>
-      </w:r>
-      <w:hyperlink w:history="1" r:id="rId2vsdpogs3im3ubjtnbws_">
+        <w:t xml:space="preserve"> – </w:t>
+      </w:r>
+      <w:hyperlink w:history="1" r:id="rIdvxqpt7jiwbyzbqmrkkk09">
         <w:r>
           <w:rPr>
             <w:rStyle w:val="Hyperlink"/>
@@ -12733,7 +12733,7 @@
         <w:szCs w:val="18"/>
         <w:rtl/>
       </w:rPr>
-      <w:t xml:space="preserve">راهنمای راه‌اندازی سایت خشایار · صفحهٔ </w:t>
+      <w:t xml:space="preserve">راهنمای راه‌اندازی سایت خشایار – صفحهٔ </w:t>
     </w:r>
     <w:r>
       <w:rPr>

</xml_diff>